<commit_message>
Fix download button text color in footer
</commit_message>
<xml_diff>
--- a/kp.docx
+++ b/kp.docx
@@ -98,6 +98,19 @@
       <w:pPr>
         <w:pStyle w:val="BodyText"/>
       </w:pPr>
+      <w:hyperlink r:id="rId10">
+        <w:r>
+          <w:rPr>
+            <w:rStyle w:val="Hyperlink"/>
+          </w:rPr>
+          <w:t xml:space="preserve">Скачать в Word</w:t>
+        </w:r>
+      </w:hyperlink>
+    </w:p>
+    <w:p>
+      <w:pPr>
+        <w:pStyle w:val="BodyText"/>
+      </w:pPr>
       <w:r>
         <w:t xml:space="preserve">Автотехцентр «АвтоТехнология» предлагает Вам сотрудничество, результатом которого будет</w:t>
       </w:r>
@@ -136,7 +149,7 @@
         <w:t xml:space="preserve">легковые автомобили отечественных и зарубежных марок, внедорожники, кроссоверы, микроавтобусы, коммерческий транспорт (газели, микроавтобусы высотой до 4 м).</w:t>
       </w:r>
     </w:p>
-    <w:bookmarkStart w:id="13" w:name="цели-сотрудничества"/>
+    <w:bookmarkStart w:id="14" w:name="цели-сотрудничества"/>
     <w:p>
       <w:pPr>
         <w:pStyle w:val="Heading2"/>
@@ -153,7 +166,7 @@
         <w:t xml:space="preserve">1</w:t>
       </w:r>
     </w:p>
-    <w:bookmarkStart w:id="10" w:name="уменьшить-себестоимость-ремонта"/>
+    <w:bookmarkStart w:id="11" w:name="уменьшить-себестоимость-ремонта"/>
     <w:p>
       <w:pPr>
         <w:pStyle w:val="Heading3"/>
@@ -183,7 +196,7 @@
         <w:t xml:space="preserve">.</w:t>
       </w:r>
     </w:p>
-    <w:bookmarkEnd w:id="10"/>
+    <w:bookmarkEnd w:id="11"/>
     <w:p>
       <w:pPr>
         <w:pStyle w:val="BodyText"/>
@@ -192,7 +205,7 @@
         <w:t xml:space="preserve">2</w:t>
       </w:r>
     </w:p>
-    <w:bookmarkStart w:id="11" w:name="сократить-сроки-ремонта"/>
+    <w:bookmarkStart w:id="12" w:name="сократить-сроки-ремонта"/>
     <w:p>
       <w:pPr>
         <w:pStyle w:val="Heading3"/>
@@ -209,7 +222,7 @@
         <w:t xml:space="preserve">Все работы проводятся в одном месте: ТО, кузовной и слесарный ремонт, ремонт двигателя и электрики, обслуживание/заправка климатических систем, шиномонтажные услуги, регулировка углов развал-схождения, ремонт по направлениям от страховых компаний.</w:t>
       </w:r>
     </w:p>
-    <w:bookmarkEnd w:id="11"/>
+    <w:bookmarkEnd w:id="12"/>
     <w:p>
       <w:pPr>
         <w:pStyle w:val="BodyText"/>
@@ -218,7 +231,7 @@
         <w:t xml:space="preserve">3</w:t>
       </w:r>
     </w:p>
-    <w:bookmarkStart w:id="12" w:name="повысить-качество-ремонта"/>
+    <w:bookmarkStart w:id="13" w:name="повысить-качество-ремонта"/>
     <w:p>
       <w:pPr>
         <w:pStyle w:val="Heading3"/>
@@ -235,9 +248,9 @@
         <w:t xml:space="preserve">Для Вашей организации будет разработан индивидуальный график ремонта и обслуживания автомобилей. На все выполненные работы предоставляется гарантия.</w:t>
       </w:r>
     </w:p>
-    <w:bookmarkEnd w:id="12"/>
     <w:bookmarkEnd w:id="13"/>
-    <w:bookmarkStart w:id="14" w:name="почему-выгодно-ремонтировать-у-нас"/>
+    <w:bookmarkEnd w:id="14"/>
+    <w:bookmarkStart w:id="15" w:name="почему-выгодно-ремонтировать-у-нас"/>
     <w:p>
       <w:pPr>
         <w:pStyle w:val="Heading2"/>
@@ -400,8 +413,8 @@
         <w:t xml:space="preserve">обо всех стадиях ремонта (по желанию)</w:t>
       </w:r>
     </w:p>
-    <w:bookmarkEnd w:id="14"/>
-    <w:bookmarkStart w:id="17" w:name="основные-виды-услуг"/>
+    <w:bookmarkEnd w:id="15"/>
+    <w:bookmarkStart w:id="18" w:name="основные-виды-услуг"/>
     <w:p>
       <w:pPr>
         <w:pStyle w:val="Heading2"/>
@@ -410,7 +423,7 @@
         <w:t xml:space="preserve">Основные виды услуг</w:t>
       </w:r>
     </w:p>
-    <w:bookmarkStart w:id="15" w:name="слесарный-участок"/>
+    <w:bookmarkStart w:id="16" w:name="слесарный-участок"/>
     <w:p>
       <w:pPr>
         <w:pStyle w:val="Heading3"/>
@@ -563,8 +576,8 @@
         <w:t xml:space="preserve">Шиномонтаж</w:t>
       </w:r>
     </w:p>
-    <w:bookmarkEnd w:id="15"/>
-    <w:bookmarkStart w:id="16" w:name="малярно-кузовной-цех"/>
+    <w:bookmarkEnd w:id="16"/>
+    <w:bookmarkStart w:id="17" w:name="малярно-кузовной-цех"/>
     <w:p>
       <w:pPr>
         <w:pStyle w:val="Heading3"/>
@@ -681,9 +694,9 @@
         <w:t xml:space="preserve">Полировка кузова</w:t>
       </w:r>
     </w:p>
-    <w:bookmarkEnd w:id="16"/>
     <w:bookmarkEnd w:id="17"/>
-    <w:bookmarkStart w:id="18" w:name="стоимость-нормо-часа"/>
+    <w:bookmarkEnd w:id="18"/>
+    <w:bookmarkStart w:id="19" w:name="стоимость-нормо-часа"/>
     <w:p>
       <w:pPr>
         <w:pStyle w:val="Heading2"/>
@@ -882,8 +895,8 @@
         </w:tc>
       </w:tr>
     </w:tbl>
-    <w:bookmarkEnd w:id="18"/>
-    <w:bookmarkStart w:id="19" w:name="стоимость-лкм-на-один-элемент"/>
+    <w:bookmarkEnd w:id="19"/>
+    <w:bookmarkStart w:id="20" w:name="стоимость-лкм-на-один-элемент"/>
     <w:p>
       <w:pPr>
         <w:pStyle w:val="Heading2"/>
@@ -1161,8 +1174,8 @@
         </w:tc>
       </w:tr>
     </w:tbl>
-    <w:bookmarkEnd w:id="19"/>
-    <w:bookmarkStart w:id="23" w:name="дополнительные-способы-экономии"/>
+    <w:bookmarkEnd w:id="20"/>
+    <w:bookmarkStart w:id="24" w:name="дополнительные-способы-экономии"/>
     <w:p>
       <w:pPr>
         <w:pStyle w:val="Heading2"/>
@@ -1179,7 +1192,7 @@
         <w:t xml:space="preserve">1</w:t>
       </w:r>
     </w:p>
-    <w:bookmarkStart w:id="20" w:name="экономия-на-неоригинальных-запчастях"/>
+    <w:bookmarkStart w:id="21" w:name="экономия-на-неоригинальных-запчастях"/>
     <w:p>
       <w:pPr>
         <w:pStyle w:val="Heading3"/>
@@ -1206,7 +1219,7 @@
         <w:t xml:space="preserve">Сумма счёта сокращается вдвое.</w:t>
       </w:r>
     </w:p>
-    <w:bookmarkEnd w:id="20"/>
+    <w:bookmarkEnd w:id="21"/>
     <w:p>
       <w:pPr>
         <w:pStyle w:val="BodyText"/>
@@ -1215,7 +1228,7 @@
         <w:t xml:space="preserve">2</w:t>
       </w:r>
     </w:p>
-    <w:bookmarkStart w:id="21" w:name="Xc0034a7efd2e828abf1809205b69712bafe4e33"/>
+    <w:bookmarkStart w:id="22" w:name="Xc0034a7efd2e828abf1809205b69712bafe4e33"/>
     <w:p>
       <w:pPr>
         <w:pStyle w:val="Heading3"/>
@@ -1232,7 +1245,7 @@
         <w:t xml:space="preserve">Имея все виды сварочных аппаратов, надёжно восстанавливаем разрывы и трещины креплений двигателя, КПП и подвесного оборудования. Избегаете покупки дорогих агрегатов и простоя.</w:t>
       </w:r>
     </w:p>
-    <w:bookmarkEnd w:id="21"/>
+    <w:bookmarkEnd w:id="22"/>
     <w:p>
       <w:pPr>
         <w:pStyle w:val="BodyText"/>
@@ -1241,7 +1254,7 @@
         <w:t xml:space="preserve">3</w:t>
       </w:r>
     </w:p>
-    <w:bookmarkStart w:id="22" w:name="экономия-на-кузовном-ремонте-до-50"/>
+    <w:bookmarkStart w:id="23" w:name="экономия-на-кузовном-ремонте-до-50"/>
     <w:p>
       <w:pPr>
         <w:pStyle w:val="Heading3"/>
@@ -1258,7 +1271,7 @@
         <w:t xml:space="preserve">Восстанавливаем редкие и дорогие детали кузова, включая алюминиевые. Основная сумма кузовного ремонта на 70% состоит из запчастей — восстанавливая детали, мы сокращаем счёт вдвое.</w:t>
       </w:r>
     </w:p>
-    <w:bookmarkEnd w:id="22"/>
+    <w:bookmarkEnd w:id="23"/>
     <w:p>
       <w:pPr>
         <w:pStyle w:val="BodyText"/>
@@ -1277,8 +1290,8 @@
         <w:t xml:space="preserve">кузовные работы — 6 месяцев, покрасочные работы — 6 месяцев, слесарные работы — 20 дней, ремонт агрегатов — 6 000 км или 4 месяца.</w:t>
       </w:r>
     </w:p>
-    <w:bookmarkEnd w:id="23"/>
-    <w:bookmarkStart w:id="26" w:name="скидки-для-сотрудников-вашей-организации"/>
+    <w:bookmarkEnd w:id="24"/>
+    <w:bookmarkStart w:id="27" w:name="скидки-для-сотрудников-вашей-организации"/>
     <w:p>
       <w:pPr>
         <w:pStyle w:val="Heading2"/>
@@ -1400,7 +1413,7 @@
       <w:r>
         <w:t xml:space="preserve"> </w:t>
       </w:r>
-      <w:hyperlink r:id="rId24">
+      <w:hyperlink r:id="rId25">
         <w:r>
           <w:rPr>
             <w:rStyle w:val="Hyperlink"/>
@@ -1417,7 +1430,7 @@
       <w:r>
         <w:t xml:space="preserve"> </w:t>
       </w:r>
-      <w:hyperlink r:id="rId25">
+      <w:hyperlink r:id="rId26">
         <w:r>
           <w:rPr>
             <w:rStyle w:val="Hyperlink"/>
@@ -1438,6 +1451,19 @@
       <w:pPr>
         <w:pStyle w:val="BodyText"/>
       </w:pPr>
+      <w:hyperlink r:id="rId10">
+        <w:r>
+          <w:rPr>
+            <w:rStyle w:val="Hyperlink"/>
+          </w:rPr>
+          <w:t xml:space="preserve">Скачать в Word</w:t>
+        </w:r>
+      </w:hyperlink>
+    </w:p>
+    <w:p>
+      <w:pPr>
+        <w:pStyle w:val="BodyText"/>
+      </w:pPr>
       <w:r>
         <w:t xml:space="preserve">Мы очень надеемся, что наше предложение заинтересовало Вас, и уверены, что работая с Автотехцентром «АвтоТехнология», Вы сразу почувствуете экономию бюджета.</w:t>
       </w:r>
@@ -1466,7 +1492,7 @@
         <w:t xml:space="preserve">Автотехцентр «АвтоТехнология»</w:t>
       </w:r>
     </w:p>
-    <w:bookmarkEnd w:id="26"/>
+    <w:bookmarkEnd w:id="27"/>
     <w:sectPr>
       <w:footnotePr>
         <w:numRestart w:val="eachSect"/>

</xml_diff>

<commit_message>
Update KP docx: Times New Roman font
</commit_message>
<xml_diff>
--- a/kp.docx
+++ b/kp.docx
@@ -1742,6 +1742,10 @@
   <w:style w:default="1" w:styleId="Normal" w:type="paragraph">
     <w:name w:val="Normal"/>
     <w:qFormat/>
+    <w:rPr>
+      <w:rFonts w:ascii="Times New Roman" w:hAnsi="Times New Roman"/>
+      <w:sz w:val="26"/>
+    </w:rPr>
   </w:style>
   <w:style w:styleId="BodyText" w:type="paragraph">
     <w:name w:val="Body Text"/>
@@ -1914,9 +1918,10 @@
       <w:outlineLvl w:val="0"/>
     </w:pPr>
     <w:rPr>
-      <w:rFonts w:asciiTheme="majorHAnsi" w:cstheme="majorBidi" w:eastAsiaTheme="majorEastAsia" w:hAnsiTheme="majorHAnsi"/>
+      <w:rFonts w:ascii="Times New Roman" w:asciiTheme="majorHAnsi" w:cstheme="majorBidi" w:eastAsiaTheme="majorEastAsia" w:hAnsi="Times New Roman" w:hAnsiTheme="majorHAnsi"/>
+      <w:b/>
       <w:color w:themeColor="accent1" w:themeShade="BF" w:val="0F4761"/>
-      <w:sz w:val="40"/>
+      <w:sz w:val="36"/>
       <w:szCs w:val="40"/>
     </w:rPr>
   </w:style>
@@ -1937,9 +1942,10 @@
       <w:outlineLvl w:val="1"/>
     </w:pPr>
     <w:rPr>
-      <w:rFonts w:asciiTheme="majorHAnsi" w:cstheme="majorBidi" w:eastAsiaTheme="majorEastAsia" w:hAnsiTheme="majorHAnsi"/>
+      <w:rFonts w:ascii="Times New Roman" w:asciiTheme="majorHAnsi" w:cstheme="majorBidi" w:eastAsiaTheme="majorEastAsia" w:hAnsi="Times New Roman" w:hAnsiTheme="majorHAnsi"/>
+      <w:b/>
       <w:color w:themeColor="accent1" w:themeShade="BF" w:val="0F4761"/>
-      <w:sz w:val="32"/>
+      <w:sz w:val="30"/>
       <w:szCs w:val="32"/>
     </w:rPr>
   </w:style>
@@ -1960,9 +1966,10 @@
       <w:outlineLvl w:val="2"/>
     </w:pPr>
     <w:rPr>
-      <w:rFonts w:cstheme="majorBidi" w:eastAsiaTheme="majorEastAsia"/>
+      <w:rFonts w:ascii="Times New Roman" w:cstheme="majorBidi" w:eastAsiaTheme="majorEastAsia" w:hAnsi="Times New Roman"/>
+      <w:b/>
       <w:color w:themeColor="accent1" w:themeShade="BF" w:val="0F4761"/>
-      <w:sz w:val="28"/>
+      <w:sz w:val="26"/>
       <w:szCs w:val="28"/>
     </w:rPr>
   </w:style>

</xml_diff>